<commit_message>
fix: print San Severo as fixed text in attachments 2 and 3
Both forms are always issued by San Severo, so the heading and the place
before the closing date no longer come from the client's municipality,
which printed Foggia.

Co-Authored-By: Claude Opus 5.5 (1M context) <noreply@anthropic.com>
</commit_message>
<xml_diff>
--- a/templates/6.docx
+++ b/templates/6.docx
@@ -289,7 +289,7 @@
           <w:szCs w:val="40"/>
           <w:u w:val="single"/>
         </w:rPr>
-        <w:t>ALL’UFFICIALE DELLO STATO CIVILE COMUNE DI {ownerCity}</w:t>
+        <w:t>ALL’UFFICIALE DELLO STATO CIVILE COMUNE DI SAN SEVERO</w:t>
       </w:r>
     </w:p>
     <w:p>
@@ -1030,7 +1030,7 @@
           <w:sz w:val="28"/>
           <w:szCs w:val="28"/>
         </w:rPr>
-        <w:t xml:space="preserve">{ownerCityName} il </w:t>
+        <w:t xml:space="preserve">San Severo il </w:t>
       </w:r>
       <w:r>
         <w:rPr>

</xml_diff>

<commit_message>
fix: print San Severo as fixed text in attachments 2 and 3 (#16)
* fix: print San Severo as fixed text in attachments 2 and 3

Both forms are always issued by San Severo, so the heading and the place
before the closing date no longer come from the client's municipality,
which printed Foggia.

Co-Authored-By: Claude Opus 5.5 (1M context) <noreply@anthropic.com>

* feat: mark the art. 10bis form as Torremaggiore only

Co-Authored-By: Claude Opus 5.5 (1M context) <noreply@anthropic.com>

---------

Co-authored-by: Claude Opus 5.5 (1M context) <noreply@anthropic.com>
</commit_message>
<xml_diff>
--- a/templates/6.docx
+++ b/templates/6.docx
@@ -289,7 +289,7 @@
           <w:szCs w:val="40"/>
           <w:u w:val="single"/>
         </w:rPr>
-        <w:t>ALL’UFFICIALE DELLO STATO CIVILE COMUNE DI {ownerCity}</w:t>
+        <w:t>ALL’UFFICIALE DELLO STATO CIVILE COMUNE DI SAN SEVERO</w:t>
       </w:r>
     </w:p>
     <w:p>
@@ -1030,7 +1030,7 @@
           <w:sz w:val="28"/>
           <w:szCs w:val="28"/>
         </w:rPr>
-        <w:t xml:space="preserve">{ownerCityName} il </w:t>
+        <w:t xml:space="preserve">San Severo il </w:t>
       </w:r>
       <w:r>
         <w:rPr>

</xml_diff>